<commit_message>
Dodaj prave screenshot-ove pokrenute aplikacije u dokumentaciju
Zamenjeni placeholderi u UI poglavlju stvarnim snimcima pokrenute
aplikacije (prijava, registracija, pregled termina sa pretragom/filterom,
moje rezervacije, admin paneli za trenere/treninge/termine).
</commit_message>
<xml_diff>
--- a/docs/IT355-PZ02-Dokumentacija-AndrijaMilenkovic.docx
+++ b/docs/IT355-PZ02-Dokumentacija-AndrijaMilenkovic.docx
@@ -190,7 +190,7 @@
           </w:tcPr>
           <w:p>
             <w:r>
-              <w:t>13.08.2026.</w:t>
+              <w:t>14.08.2026.</w:t>
             </w:r>
           </w:p>
         </w:tc>
@@ -988,47 +988,118 @@
         <w:pStyle w:val="Heading3"/>
       </w:pPr>
       <w:r>
-        <w:t>Prijava / Registracija</w:t>
+        <w:t>Prijava i registracija</w:t>
       </w:r>
     </w:p>
     <w:p>
       <w:r>
-        <w:t>Forme za prijavu i registraciju korisnika. Nakon uspešne prijave, JWT token i podaci o korisniku se čuvaju u localStorage.</w:t>
+        <w:t>Forme za prijavu i registraciju korisnika. Nakon uspešne prijave, JWT token i podaci o korisniku se čuvaju u localStorage i automatski se prosleđuju u Authorization header-u svakog narednog zahteva.</w:t>
       </w:r>
     </w:p>
-    <w:tbl>
-      <w:tblPr>
-        <w:tblW w:type="auto" w:w="0"/>
-        <w:tblLook w:firstColumn="1" w:firstRow="1" w:lastColumn="0" w:lastRow="0" w:noHBand="0" w:noVBand="1" w:val="04A0"/>
-      </w:tblPr>
-      <w:tblGrid>
-        <w:gridCol w:w="8640"/>
-      </w:tblGrid>
-      <w:tr>
-        <w:tc>
-          <w:tcPr>
-            <w:tcW w:type="dxa" w:w="8640"/>
-            <w:shd w:fill="FEF3C7"/>
-          </w:tcPr>
-          <w:p>
-            <w:pPr>
-              <w:jc w:val="center"/>
-            </w:pPr>
-            <w:r>
-              <w:rPr>
-                <w:i/>
-                <w:color w:val="B45309"/>
-                <w:sz w:val="20"/>
-              </w:rPr>
-              <w:t>[ MESTO ZA SCREENSHOT: Prijava / Registracija ]</w:t>
-              <w:br/>
-              <w:t>Uneti screenshot pokrenute aplikacije pre predaje / odbrane.</w:t>
-            </w:r>
-          </w:p>
-        </w:tc>
-      </w:tr>
-    </w:tbl>
-    <w:p/>
+    <w:p>
+      <w:pPr>
+        <w:jc w:val="center"/>
+      </w:pPr>
+      <w:r>
+        <w:drawing>
+          <wp:inline xmlns:a="http://schemas.openxmlformats.org/drawingml/2006/main" xmlns:pic="http://schemas.openxmlformats.org/drawingml/2006/picture">
+            <wp:extent cx="5120640" cy="3200400"/>
+            <wp:docPr id="3" name="Picture 3"/>
+            <wp:cNvGraphicFramePr>
+              <a:graphicFrameLocks noChangeAspect="1"/>
+            </wp:cNvGraphicFramePr>
+            <a:graphic>
+              <a:graphicData uri="http://schemas.openxmlformats.org/drawingml/2006/picture">
+                <pic:pic>
+                  <pic:nvPicPr>
+                    <pic:cNvPr id="0" name="screenshot_prijava.png"/>
+                    <pic:cNvPicPr/>
+                  </pic:nvPicPr>
+                  <pic:blipFill>
+                    <a:blip r:embed="rId11"/>
+                    <a:stretch>
+                      <a:fillRect/>
+                    </a:stretch>
+                  </pic:blipFill>
+                  <pic:spPr>
+                    <a:xfrm>
+                      <a:off x="0" y="0"/>
+                      <a:ext cx="5120640" cy="3200400"/>
+                    </a:xfrm>
+                    <a:prstGeom prst="rect"/>
+                  </pic:spPr>
+                </pic:pic>
+              </a:graphicData>
+            </a:graphic>
+          </wp:inline>
+        </w:drawing>
+      </w:r>
+    </w:p>
+    <w:p>
+      <w:pPr>
+        <w:jc w:val="center"/>
+      </w:pPr>
+      <w:r>
+        <w:rPr>
+          <w:i/>
+          <w:color w:val="52606D"/>
+          <w:sz w:val="18"/>
+        </w:rPr>
+        <w:t>Slika 4 – Stranica za prijavu</w:t>
+      </w:r>
+    </w:p>
+    <w:p>
+      <w:pPr>
+        <w:jc w:val="center"/>
+      </w:pPr>
+      <w:r>
+        <w:drawing>
+          <wp:inline xmlns:a="http://schemas.openxmlformats.org/drawingml/2006/main" xmlns:pic="http://schemas.openxmlformats.org/drawingml/2006/picture">
+            <wp:extent cx="5120640" cy="3200400"/>
+            <wp:docPr id="4" name="Picture 4"/>
+            <wp:cNvGraphicFramePr>
+              <a:graphicFrameLocks noChangeAspect="1"/>
+            </wp:cNvGraphicFramePr>
+            <a:graphic>
+              <a:graphicData uri="http://schemas.openxmlformats.org/drawingml/2006/picture">
+                <pic:pic>
+                  <pic:nvPicPr>
+                    <pic:cNvPr id="0" name="screenshot_registracija.png"/>
+                    <pic:cNvPicPr/>
+                  </pic:nvPicPr>
+                  <pic:blipFill>
+                    <a:blip r:embed="rId12"/>
+                    <a:stretch>
+                      <a:fillRect/>
+                    </a:stretch>
+                  </pic:blipFill>
+                  <pic:spPr>
+                    <a:xfrm>
+                      <a:off x="0" y="0"/>
+                      <a:ext cx="5120640" cy="3200400"/>
+                    </a:xfrm>
+                    <a:prstGeom prst="rect"/>
+                  </pic:spPr>
+                </pic:pic>
+              </a:graphicData>
+            </a:graphic>
+          </wp:inline>
+        </w:drawing>
+      </w:r>
+    </w:p>
+    <w:p>
+      <w:pPr>
+        <w:jc w:val="center"/>
+      </w:pPr>
+      <w:r>
+        <w:rPr>
+          <w:i/>
+          <w:color w:val="52606D"/>
+          <w:sz w:val="18"/>
+        </w:rPr>
+        <w:t>Slika 5 – Stranica za registraciju</w:t>
+      </w:r>
+    </w:p>
     <w:p>
       <w:pPr>
         <w:pStyle w:val="Heading3"/>
@@ -1039,42 +1110,61 @@
     </w:p>
     <w:p>
       <w:r>
-        <w:t>Prikazuje sve buduće termine u vidu kartica – naziv treninga, trener, vreme održavanja, trajanje i broj slobodnih mesta. Dugme za rezervaciju menja tekst u zavisnosti od toga da li ima slobodnih mesta (rezerviši / prijavi se na listu čekanja).</w:t>
+        <w:t>Prikazuje sve buduće termine u vidu kartica – naziv treninga, trener, vreme održavanja, trajanje i broj slobodnih mesta, uz pretragu po treningu/treneru i filter za prikaz samo termina sa slobodnim mestima. Dugme za rezervaciju menja tekst u zavisnosti od toga da li ima slobodnih mesta (rezerviši / prijavi se na listu čekanja).</w:t>
       </w:r>
     </w:p>
-    <w:tbl>
-      <w:tblPr>
-        <w:tblW w:type="auto" w:w="0"/>
-        <w:tblLook w:firstColumn="1" w:firstRow="1" w:lastColumn="0" w:lastRow="0" w:noHBand="0" w:noVBand="1" w:val="04A0"/>
-      </w:tblPr>
-      <w:tblGrid>
-        <w:gridCol w:w="8640"/>
-      </w:tblGrid>
-      <w:tr>
-        <w:tc>
-          <w:tcPr>
-            <w:tcW w:type="dxa" w:w="8640"/>
-            <w:shd w:fill="FEF3C7"/>
-          </w:tcPr>
-          <w:p>
-            <w:pPr>
-              <w:jc w:val="center"/>
-            </w:pPr>
-            <w:r>
-              <w:rPr>
-                <w:i/>
-                <w:color w:val="B45309"/>
-                <w:sz w:val="20"/>
-              </w:rPr>
-              <w:t>[ MESTO ZA SCREENSHOT: Pregled termina ]</w:t>
-              <w:br/>
-              <w:t>Uneti screenshot pokrenute aplikacije pre predaje / odbrane.</w:t>
-            </w:r>
-          </w:p>
-        </w:tc>
-      </w:tr>
-    </w:tbl>
-    <w:p/>
+    <w:p>
+      <w:pPr>
+        <w:jc w:val="center"/>
+      </w:pPr>
+      <w:r>
+        <w:drawing>
+          <wp:inline xmlns:a="http://schemas.openxmlformats.org/drawingml/2006/main" xmlns:pic="http://schemas.openxmlformats.org/drawingml/2006/picture">
+            <wp:extent cx="5760720" cy="3600450"/>
+            <wp:docPr id="5" name="Picture 5"/>
+            <wp:cNvGraphicFramePr>
+              <a:graphicFrameLocks noChangeAspect="1"/>
+            </wp:cNvGraphicFramePr>
+            <a:graphic>
+              <a:graphicData uri="http://schemas.openxmlformats.org/drawingml/2006/picture">
+                <pic:pic>
+                  <pic:nvPicPr>
+                    <pic:cNvPr id="0" name="screenshot_termini.png"/>
+                    <pic:cNvPicPr/>
+                  </pic:nvPicPr>
+                  <pic:blipFill>
+                    <a:blip r:embed="rId13"/>
+                    <a:stretch>
+                      <a:fillRect/>
+                    </a:stretch>
+                  </pic:blipFill>
+                  <pic:spPr>
+                    <a:xfrm>
+                      <a:off x="0" y="0"/>
+                      <a:ext cx="5760720" cy="3600450"/>
+                    </a:xfrm>
+                    <a:prstGeom prst="rect"/>
+                  </pic:spPr>
+                </pic:pic>
+              </a:graphicData>
+            </a:graphic>
+          </wp:inline>
+        </w:drawing>
+      </w:r>
+    </w:p>
+    <w:p>
+      <w:pPr>
+        <w:jc w:val="center"/>
+      </w:pPr>
+      <w:r>
+        <w:rPr>
+          <w:i/>
+          <w:color w:val="52606D"/>
+          <w:sz w:val="18"/>
+        </w:rPr>
+        <w:t>Slika 6 – Pregled slobodnih termina</w:t>
+      </w:r>
+    </w:p>
     <w:p>
       <w:pPr>
         <w:pStyle w:val="Heading3"/>
@@ -1088,85 +1178,227 @@
         <w:t>Tabelarni prikaz svih rezervacija ulogovanog korisnika sa statusom (potvrđena / na čekanju / otkazana) i mogućnošću otkazivanja.</w:t>
       </w:r>
     </w:p>
-    <w:tbl>
-      <w:tblPr>
-        <w:tblW w:type="auto" w:w="0"/>
-        <w:tblLook w:firstColumn="1" w:firstRow="1" w:lastColumn="0" w:lastRow="0" w:noHBand="0" w:noVBand="1" w:val="04A0"/>
-      </w:tblPr>
-      <w:tblGrid>
-        <w:gridCol w:w="8640"/>
-      </w:tblGrid>
-      <w:tr>
-        <w:tc>
-          <w:tcPr>
-            <w:tcW w:type="dxa" w:w="8640"/>
-            <w:shd w:fill="FEF3C7"/>
-          </w:tcPr>
-          <w:p>
-            <w:pPr>
-              <w:jc w:val="center"/>
-            </w:pPr>
-            <w:r>
-              <w:rPr>
-                <w:i/>
-                <w:color w:val="B45309"/>
-                <w:sz w:val="20"/>
-              </w:rPr>
-              <w:t>[ MESTO ZA SCREENSHOT: Moje rezervacije ]</w:t>
-              <w:br/>
-              <w:t>Uneti screenshot pokrenute aplikacije pre predaje / odbrane.</w:t>
-            </w:r>
-          </w:p>
-        </w:tc>
-      </w:tr>
-    </w:tbl>
-    <w:p/>
+    <w:p>
+      <w:pPr>
+        <w:jc w:val="center"/>
+      </w:pPr>
+      <w:r>
+        <w:drawing>
+          <wp:inline xmlns:a="http://schemas.openxmlformats.org/drawingml/2006/main" xmlns:pic="http://schemas.openxmlformats.org/drawingml/2006/picture">
+            <wp:extent cx="5760720" cy="3600450"/>
+            <wp:docPr id="6" name="Picture 6"/>
+            <wp:cNvGraphicFramePr>
+              <a:graphicFrameLocks noChangeAspect="1"/>
+            </wp:cNvGraphicFramePr>
+            <a:graphic>
+              <a:graphicData uri="http://schemas.openxmlformats.org/drawingml/2006/picture">
+                <pic:pic>
+                  <pic:nvPicPr>
+                    <pic:cNvPr id="0" name="screenshot_moje_rezervacije.png"/>
+                    <pic:cNvPicPr/>
+                  </pic:nvPicPr>
+                  <pic:blipFill>
+                    <a:blip r:embed="rId14"/>
+                    <a:stretch>
+                      <a:fillRect/>
+                    </a:stretch>
+                  </pic:blipFill>
+                  <pic:spPr>
+                    <a:xfrm>
+                      <a:off x="0" y="0"/>
+                      <a:ext cx="5760720" cy="3600450"/>
+                    </a:xfrm>
+                    <a:prstGeom prst="rect"/>
+                  </pic:spPr>
+                </pic:pic>
+              </a:graphicData>
+            </a:graphic>
+          </wp:inline>
+        </w:drawing>
+      </w:r>
+    </w:p>
+    <w:p>
+      <w:pPr>
+        <w:jc w:val="center"/>
+      </w:pPr>
+      <w:r>
+        <w:rPr>
+          <w:i/>
+          <w:color w:val="52606D"/>
+          <w:sz w:val="18"/>
+        </w:rPr>
+        <w:t>Slika 7 – Moje rezervacije</w:t>
+      </w:r>
+    </w:p>
     <w:p>
       <w:pPr>
         <w:pStyle w:val="Heading3"/>
       </w:pPr>
       <w:r>
-        <w:t>Admin – Treneri / Treninzi / Termini</w:t>
+        <w:t>Admin – Treneri, Treninzi, Termini</w:t>
       </w:r>
     </w:p>
     <w:p>
       <w:r>
-        <w:t>Administratorski paneli sa formama i tabelama za CRUD operacije nad trenerima, treninzima i terminima. Dostupni su isključivo korisnicima sa ulogom ADMIN.</w:t>
+        <w:t>Administratorski paneli sa formama i tabelama za CRUD operacije nad trenerima, treninzima i terminima. Dostupni su isključivo korisnicima sa ulogom ADMIN – zaštićeni su i na frontend-u (ZasticenaRuta) i na backend-u (RBAC pravila u SecurityConfig).</w:t>
       </w:r>
     </w:p>
-    <w:tbl>
-      <w:tblPr>
-        <w:tblW w:type="auto" w:w="0"/>
-        <w:tblLook w:firstColumn="1" w:firstRow="1" w:lastColumn="0" w:lastRow="0" w:noHBand="0" w:noVBand="1" w:val="04A0"/>
-      </w:tblPr>
-      <w:tblGrid>
-        <w:gridCol w:w="8640"/>
-      </w:tblGrid>
-      <w:tr>
-        <w:tc>
-          <w:tcPr>
-            <w:tcW w:type="dxa" w:w="8640"/>
-            <w:shd w:fill="FEF3C7"/>
-          </w:tcPr>
-          <w:p>
-            <w:pPr>
-              <w:jc w:val="center"/>
-            </w:pPr>
-            <w:r>
-              <w:rPr>
-                <w:i/>
-                <w:color w:val="B45309"/>
-                <w:sz w:val="20"/>
-              </w:rPr>
-              <w:t>[ MESTO ZA SCREENSHOT: Admin – Treneri / Treninzi / Termini ]</w:t>
-              <w:br/>
-              <w:t>Uneti screenshot pokrenute aplikacije pre predaje / odbrane.</w:t>
-            </w:r>
-          </w:p>
-        </w:tc>
-      </w:tr>
-    </w:tbl>
-    <w:p/>
+    <w:p>
+      <w:pPr>
+        <w:jc w:val="center"/>
+      </w:pPr>
+      <w:r>
+        <w:drawing>
+          <wp:inline xmlns:a="http://schemas.openxmlformats.org/drawingml/2006/main" xmlns:pic="http://schemas.openxmlformats.org/drawingml/2006/picture">
+            <wp:extent cx="5760720" cy="3600450"/>
+            <wp:docPr id="7" name="Picture 7"/>
+            <wp:cNvGraphicFramePr>
+              <a:graphicFrameLocks noChangeAspect="1"/>
+            </wp:cNvGraphicFramePr>
+            <a:graphic>
+              <a:graphicData uri="http://schemas.openxmlformats.org/drawingml/2006/picture">
+                <pic:pic>
+                  <pic:nvPicPr>
+                    <pic:cNvPr id="0" name="screenshot_admin_treneri.png"/>
+                    <pic:cNvPicPr/>
+                  </pic:nvPicPr>
+                  <pic:blipFill>
+                    <a:blip r:embed="rId15"/>
+                    <a:stretch>
+                      <a:fillRect/>
+                    </a:stretch>
+                  </pic:blipFill>
+                  <pic:spPr>
+                    <a:xfrm>
+                      <a:off x="0" y="0"/>
+                      <a:ext cx="5760720" cy="3600450"/>
+                    </a:xfrm>
+                    <a:prstGeom prst="rect"/>
+                  </pic:spPr>
+                </pic:pic>
+              </a:graphicData>
+            </a:graphic>
+          </wp:inline>
+        </w:drawing>
+      </w:r>
+    </w:p>
+    <w:p>
+      <w:pPr>
+        <w:jc w:val="center"/>
+      </w:pPr>
+      <w:r>
+        <w:rPr>
+          <w:i/>
+          <w:color w:val="52606D"/>
+          <w:sz w:val="18"/>
+        </w:rPr>
+        <w:t>Slika 8 – Upravljanje trenerima</w:t>
+      </w:r>
+    </w:p>
+    <w:p>
+      <w:pPr>
+        <w:jc w:val="center"/>
+      </w:pPr>
+      <w:r>
+        <w:drawing>
+          <wp:inline xmlns:a="http://schemas.openxmlformats.org/drawingml/2006/main" xmlns:pic="http://schemas.openxmlformats.org/drawingml/2006/picture">
+            <wp:extent cx="5760720" cy="3600450"/>
+            <wp:docPr id="8" name="Picture 8"/>
+            <wp:cNvGraphicFramePr>
+              <a:graphicFrameLocks noChangeAspect="1"/>
+            </wp:cNvGraphicFramePr>
+            <a:graphic>
+              <a:graphicData uri="http://schemas.openxmlformats.org/drawingml/2006/picture">
+                <pic:pic>
+                  <pic:nvPicPr>
+                    <pic:cNvPr id="0" name="screenshot_admin_treninzi.png"/>
+                    <pic:cNvPicPr/>
+                  </pic:nvPicPr>
+                  <pic:blipFill>
+                    <a:blip r:embed="rId16"/>
+                    <a:stretch>
+                      <a:fillRect/>
+                    </a:stretch>
+                  </pic:blipFill>
+                  <pic:spPr>
+                    <a:xfrm>
+                      <a:off x="0" y="0"/>
+                      <a:ext cx="5760720" cy="3600450"/>
+                    </a:xfrm>
+                    <a:prstGeom prst="rect"/>
+                  </pic:spPr>
+                </pic:pic>
+              </a:graphicData>
+            </a:graphic>
+          </wp:inline>
+        </w:drawing>
+      </w:r>
+    </w:p>
+    <w:p>
+      <w:pPr>
+        <w:jc w:val="center"/>
+      </w:pPr>
+      <w:r>
+        <w:rPr>
+          <w:i/>
+          <w:color w:val="52606D"/>
+          <w:sz w:val="18"/>
+        </w:rPr>
+        <w:t>Slika 9 – Upravljanje treninzima</w:t>
+      </w:r>
+    </w:p>
+    <w:p>
+      <w:pPr>
+        <w:jc w:val="center"/>
+      </w:pPr>
+      <w:r>
+        <w:drawing>
+          <wp:inline xmlns:a="http://schemas.openxmlformats.org/drawingml/2006/main" xmlns:pic="http://schemas.openxmlformats.org/drawingml/2006/picture">
+            <wp:extent cx="5760720" cy="3600450"/>
+            <wp:docPr id="9" name="Picture 9"/>
+            <wp:cNvGraphicFramePr>
+              <a:graphicFrameLocks noChangeAspect="1"/>
+            </wp:cNvGraphicFramePr>
+            <a:graphic>
+              <a:graphicData uri="http://schemas.openxmlformats.org/drawingml/2006/picture">
+                <pic:pic>
+                  <pic:nvPicPr>
+                    <pic:cNvPr id="0" name="screenshot_admin_termini.png"/>
+                    <pic:cNvPicPr/>
+                  </pic:nvPicPr>
+                  <pic:blipFill>
+                    <a:blip r:embed="rId17"/>
+                    <a:stretch>
+                      <a:fillRect/>
+                    </a:stretch>
+                  </pic:blipFill>
+                  <pic:spPr>
+                    <a:xfrm>
+                      <a:off x="0" y="0"/>
+                      <a:ext cx="5760720" cy="3600450"/>
+                    </a:xfrm>
+                    <a:prstGeom prst="rect"/>
+                  </pic:spPr>
+                </pic:pic>
+              </a:graphicData>
+            </a:graphic>
+          </wp:inline>
+        </w:drawing>
+      </w:r>
+    </w:p>
+    <w:p>
+      <w:pPr>
+        <w:jc w:val="center"/>
+      </w:pPr>
+      <w:r>
+        <w:rPr>
+          <w:i/>
+          <w:color w:val="52606D"/>
+          <w:sz w:val="18"/>
+        </w:rPr>
+        <w:t>Slika 10 – Upravljanje terminima</w:t>
+      </w:r>
+    </w:p>
     <w:p>
       <w:pPr>
         <w:pStyle w:val="Heading1"/>
@@ -1196,7 +1428,7 @@
         <w:drawing>
           <wp:inline xmlns:a="http://schemas.openxmlformats.org/drawingml/2006/main" xmlns:pic="http://schemas.openxmlformats.org/drawingml/2006/picture">
             <wp:extent cx="5486400" cy="3291840"/>
-            <wp:docPr id="3" name="Picture 3"/>
+            <wp:docPr id="10" name="Picture 10"/>
             <wp:cNvGraphicFramePr>
               <a:graphicFrameLocks noChangeAspect="1"/>
             </wp:cNvGraphicFramePr>
@@ -1208,7 +1440,7 @@
                     <pic:cNvPicPr/>
                   </pic:nvPicPr>
                   <pic:blipFill>
-                    <a:blip r:embed="rId11"/>
+                    <a:blip r:embed="rId18"/>
                     <a:stretch>
                       <a:fillRect/>
                     </a:stretch>

</xml_diff>